<commit_message>
add the publisher mono explanation
</commit_message>
<xml_diff>
--- a/WebFlux Notes.docx
+++ b/WebFlux Notes.docx
@@ -67,6 +67,7 @@
         <w:t xml:space="preserve">What is </w:t>
       </w:r>
       <w:proofErr w:type="spellStart"/>
+      <w:proofErr w:type="gramStart"/>
       <w:r>
         <w:rPr>
           <w:b/>
@@ -104,6 +105,7 @@
         </w:rPr>
         <w:t>:</w:t>
       </w:r>
+      <w:proofErr w:type="gramEnd"/>
     </w:p>
     <w:p>
       <w:pPr>
@@ -187,6 +189,7 @@
         <w:t xml:space="preserve">Why do we need </w:t>
       </w:r>
       <w:proofErr w:type="spellStart"/>
+      <w:proofErr w:type="gramStart"/>
       <w:r>
         <w:rPr>
           <w:b/>
@@ -212,6 +215,7 @@
         </w:rPr>
         <w:t>?:</w:t>
       </w:r>
+      <w:proofErr w:type="gramEnd"/>
     </w:p>
     <w:p>
       <w:pPr>
@@ -360,6 +364,7 @@
         <w:t xml:space="preserve">In reactive programming we have publishers and subscribers. </w:t>
       </w:r>
       <w:proofErr w:type="spellStart"/>
+      <w:proofErr w:type="gramStart"/>
       <w:r>
         <w:rPr>
           <w:color w:val="000000" w:themeColor="text1"/>
@@ -367,6 +372,7 @@
         <w:t>Its</w:t>
       </w:r>
       <w:proofErr w:type="spellEnd"/>
+      <w:proofErr w:type="gramEnd"/>
       <w:r>
         <w:rPr>
           <w:color w:val="000000" w:themeColor="text1"/>
@@ -447,13 +453,12 @@
         </w:rPr>
         <w:t>Conceptually, Mono&lt;T&gt; is not the result itself. It is an object that represents an asynchronous computation capable of producing at most one result in the future. Returning a Mono allows methods to define reactive workflows, defer execution until needed, avoid blocking threads, and compose asynchronous operations efficiently.</w:t>
       </w:r>
-    </w:p>
-    <w:p>
-      <w:pPr>
-        <w:rPr>
-          <w:color w:val="000000" w:themeColor="text1"/>
-        </w:rPr>
-      </w:pPr>
+      <w:r>
+        <w:rPr>
+          <w:color w:val="000000" w:themeColor="text1"/>
+        </w:rPr>
+        <w:t xml:space="preserve"> </w:t>
+      </w:r>
       <w:r>
         <w:rPr>
           <w:color w:val="000000" w:themeColor="text1"/>
@@ -494,25 +499,63 @@
         </w:rPr>
         <w:t>Mono as a publisher</w:t>
       </w:r>
-    </w:p>
-    <w:p>
-      <w:pPr>
-        <w:rPr>
-          <w:b/>
-          <w:bCs/>
-          <w:color w:val="000000" w:themeColor="text1"/>
-          <w:sz w:val="24"/>
-          <w:szCs w:val="24"/>
-        </w:rPr>
-      </w:pPr>
-      <w:r>
-        <w:rPr>
-          <w:b/>
-          <w:bCs/>
-          <w:color w:val="000000" w:themeColor="text1"/>
-          <w:sz w:val="24"/>
-          <w:szCs w:val="24"/>
-        </w:rPr>
+      <w:r>
+        <w:rPr>
+          <w:b/>
+          <w:bCs/>
+          <w:color w:val="000000" w:themeColor="text1"/>
+          <w:sz w:val="24"/>
+          <w:szCs w:val="24"/>
+        </w:rPr>
+        <w:t>:</w:t>
+      </w:r>
+    </w:p>
+    <w:p>
+      <w:pPr>
+        <w:rPr>
+          <w:color w:val="000000" w:themeColor="text1"/>
+        </w:rPr>
+      </w:pPr>
+      <w:r>
+        <w:rPr>
+          <w:color w:val="000000" w:themeColor="text1"/>
+        </w:rPr>
+        <w:t>A Mono is a Publisher in reactive programming because it represents a source that can publish at most one result to a Subscriber according to the Reactive Streams specification. Rather than holding an immediate value, a Mono describes an asynchronous and non-blocking computation that may eventually produce a single value, complete without producing any value, or terminate with an error. It is lazy, meaning the computation does not begin until a Subscriber requests the result, enabling efficient, event-driven communication between the producer (Publisher) and the consumer (Subscriber).</w:t>
+      </w:r>
+    </w:p>
+    <w:p>
+      <w:pPr>
+        <w:rPr>
+          <w:color w:val="000000" w:themeColor="text1"/>
+        </w:rPr>
+      </w:pPr>
+    </w:p>
+    <w:p>
+      <w:pPr>
+        <w:rPr>
+          <w:color w:val="000000" w:themeColor="text1"/>
+        </w:rPr>
+      </w:pPr>
+    </w:p>
+    <w:p>
+      <w:pPr>
+        <w:rPr>
+          <w:b/>
+          <w:bCs/>
+          <w:color w:val="000000" w:themeColor="text1"/>
+          <w:sz w:val="24"/>
+          <w:szCs w:val="24"/>
+        </w:rPr>
+      </w:pPr>
+      <w:r>
+        <w:rPr>
+          <w:b/>
+          <w:bCs/>
+          <w:color w:val="000000" w:themeColor="text1"/>
+          <w:sz w:val="24"/>
+          <w:szCs w:val="24"/>
+        </w:rPr>
+        <w:lastRenderedPageBreak/>
         <w:t>Subscribing to mono</w:t>
       </w:r>
     </w:p>

</xml_diff>

<commit_message>
add the subscriber mono
</commit_message>
<xml_diff>
--- a/WebFlux Notes.docx
+++ b/WebFlux Notes.docx
@@ -558,6 +558,36 @@
         <w:lastRenderedPageBreak/>
         <w:t>Subscribing to mono</w:t>
       </w:r>
+      <w:r>
+        <w:rPr>
+          <w:b/>
+          <w:bCs/>
+          <w:color w:val="000000" w:themeColor="text1"/>
+          <w:sz w:val="24"/>
+          <w:szCs w:val="24"/>
+        </w:rPr>
+        <w:t>:</w:t>
+      </w:r>
+    </w:p>
+    <w:p>
+      <w:pPr>
+        <w:rPr>
+          <w:color w:val="000000" w:themeColor="text1"/>
+        </w:rPr>
+      </w:pPr>
+      <w:r>
+        <w:rPr>
+          <w:color w:val="000000" w:themeColor="text1"/>
+        </w:rPr>
+        <w:t>Subscribing to a Mono is the process by which a Subscriber expresses interest in receiving the result that the Mono may produce. In reactive programming, a Mono does not execute or emit any data on its own because it is lazy. The reactive pipeline begins only when a subscription is made. Once subscribed, the Mono can produce one value, no value, or an error, after which it signals completion. Subscribing therefore activates the asynchronous, non-blocking data flow between the Mono (Publisher) and the Subscriber, allowing the result to be delivered when it becomes available.</w:t>
+      </w:r>
+    </w:p>
+    <w:p>
+      <w:pPr>
+        <w:rPr>
+          <w:color w:val="000000" w:themeColor="text1"/>
+        </w:rPr>
+      </w:pPr>
     </w:p>
     <w:p>
       <w:pPr>

</xml_diff>

<commit_message>
add logging for java
</commit_message>
<xml_diff>
--- a/WebFlux Notes.docx
+++ b/WebFlux Notes.docx
@@ -609,6 +609,174 @@
         </w:rPr>
         <w:t>Logging a mono</w:t>
       </w:r>
+      <w:r>
+        <w:rPr>
+          <w:b/>
+          <w:bCs/>
+          <w:color w:val="000000" w:themeColor="text1"/>
+          <w:sz w:val="24"/>
+          <w:szCs w:val="24"/>
+        </w:rPr>
+        <w:t>:</w:t>
+      </w:r>
+    </w:p>
+    <w:p>
+      <w:pPr>
+        <w:rPr>
+          <w:color w:val="000000" w:themeColor="text1"/>
+        </w:rPr>
+      </w:pPr>
+      <w:r>
+        <w:rPr>
+          <w:color w:val="000000" w:themeColor="text1"/>
+        </w:rPr>
+        <w:t xml:space="preserve">In Java reactive programming, logging a Mono means observing and recording the events that occur during its lifecycle without changing its </w:t>
+      </w:r>
+      <w:proofErr w:type="spellStart"/>
+      <w:r>
+        <w:rPr>
+          <w:color w:val="000000" w:themeColor="text1"/>
+        </w:rPr>
+        <w:t>behavior</w:t>
+      </w:r>
+      <w:proofErr w:type="spellEnd"/>
+      <w:r>
+        <w:rPr>
+          <w:color w:val="000000" w:themeColor="text1"/>
+        </w:rPr>
+        <w:t xml:space="preserve">. Since a Mono is lazy and represents an asynchronous computation that emits either a single value, completes without a value, or signals an error, logging is typically done using operators such as </w:t>
+      </w:r>
+      <w:proofErr w:type="spellStart"/>
+      <w:proofErr w:type="gramStart"/>
+      <w:r>
+        <w:rPr>
+          <w:color w:val="000000" w:themeColor="text1"/>
+        </w:rPr>
+        <w:t>doOnNext</w:t>
+      </w:r>
+      <w:proofErr w:type="spellEnd"/>
+      <w:r>
+        <w:rPr>
+          <w:color w:val="000000" w:themeColor="text1"/>
+        </w:rPr>
+        <w:t>(</w:t>
+      </w:r>
+      <w:proofErr w:type="gramEnd"/>
+      <w:r>
+        <w:rPr>
+          <w:color w:val="000000" w:themeColor="text1"/>
+        </w:rPr>
+        <w:t xml:space="preserve">), </w:t>
+      </w:r>
+      <w:proofErr w:type="spellStart"/>
+      <w:proofErr w:type="gramStart"/>
+      <w:r>
+        <w:rPr>
+          <w:color w:val="000000" w:themeColor="text1"/>
+        </w:rPr>
+        <w:t>doOnSuccess</w:t>
+      </w:r>
+      <w:proofErr w:type="spellEnd"/>
+      <w:r>
+        <w:rPr>
+          <w:color w:val="000000" w:themeColor="text1"/>
+        </w:rPr>
+        <w:t>(</w:t>
+      </w:r>
+      <w:proofErr w:type="gramEnd"/>
+      <w:r>
+        <w:rPr>
+          <w:color w:val="000000" w:themeColor="text1"/>
+        </w:rPr>
+        <w:t xml:space="preserve">), </w:t>
+      </w:r>
+      <w:proofErr w:type="spellStart"/>
+      <w:proofErr w:type="gramStart"/>
+      <w:r>
+        <w:rPr>
+          <w:color w:val="000000" w:themeColor="text1"/>
+        </w:rPr>
+        <w:t>doOnError</w:t>
+      </w:r>
+      <w:proofErr w:type="spellEnd"/>
+      <w:r>
+        <w:rPr>
+          <w:color w:val="000000" w:themeColor="text1"/>
+        </w:rPr>
+        <w:t>(</w:t>
+      </w:r>
+      <w:proofErr w:type="gramEnd"/>
+      <w:r>
+        <w:rPr>
+          <w:color w:val="000000" w:themeColor="text1"/>
+        </w:rPr>
+        <w:t xml:space="preserve">), </w:t>
+      </w:r>
+      <w:proofErr w:type="spellStart"/>
+      <w:proofErr w:type="gramStart"/>
+      <w:r>
+        <w:rPr>
+          <w:color w:val="000000" w:themeColor="text1"/>
+        </w:rPr>
+        <w:t>doOnSubscribe</w:t>
+      </w:r>
+      <w:proofErr w:type="spellEnd"/>
+      <w:r>
+        <w:rPr>
+          <w:color w:val="000000" w:themeColor="text1"/>
+        </w:rPr>
+        <w:t>(</w:t>
+      </w:r>
+      <w:proofErr w:type="gramEnd"/>
+      <w:r>
+        <w:rPr>
+          <w:color w:val="000000" w:themeColor="text1"/>
+        </w:rPr>
+        <w:t xml:space="preserve">), and </w:t>
+      </w:r>
+      <w:proofErr w:type="spellStart"/>
+      <w:proofErr w:type="gramStart"/>
+      <w:r>
+        <w:rPr>
+          <w:color w:val="000000" w:themeColor="text1"/>
+        </w:rPr>
+        <w:t>doFinally</w:t>
+      </w:r>
+      <w:proofErr w:type="spellEnd"/>
+      <w:r>
+        <w:rPr>
+          <w:color w:val="000000" w:themeColor="text1"/>
+        </w:rPr>
+        <w:t>(</w:t>
+      </w:r>
+      <w:proofErr w:type="gramEnd"/>
+      <w:r>
+        <w:rPr>
+          <w:color w:val="000000" w:themeColor="text1"/>
+        </w:rPr>
+        <w:t xml:space="preserve">). These operators allow developers to trace data flow, monitor execution, debug issues, and verify application </w:t>
+      </w:r>
+      <w:proofErr w:type="spellStart"/>
+      <w:r>
+        <w:rPr>
+          <w:color w:val="000000" w:themeColor="text1"/>
+        </w:rPr>
+        <w:t>behavior</w:t>
+      </w:r>
+      <w:proofErr w:type="spellEnd"/>
+      <w:r>
+        <w:rPr>
+          <w:color w:val="000000" w:themeColor="text1"/>
+        </w:rPr>
+        <w:t xml:space="preserve"> at different stages of the reactive pipeline. The logging code is executed only when the Mono is subscribed to, making it a useful, non-intrusive way to gain visibility into reactive streams while preserving their functional nature.</w:t>
+      </w:r>
+    </w:p>
+    <w:p>
+      <w:pPr>
+        <w:rPr>
+          <w:color w:val="000000" w:themeColor="text1"/>
+        </w:rPr>
+      </w:pPr>
     </w:p>
     <w:p>
       <w:pPr>

</xml_diff>

<commit_message>
finish the first part of notes
</commit_message>
<xml_diff>
--- a/WebFlux Notes.docx
+++ b/WebFlux Notes.docx
@@ -908,6 +908,107 @@
           <w:szCs w:val="24"/>
         </w:rPr>
         <w:t>Flux publisher</w:t>
+      </w:r>
+      <w:r>
+        <w:rPr>
+          <w:b/>
+          <w:bCs/>
+          <w:color w:val="000000" w:themeColor="text1"/>
+          <w:sz w:val="24"/>
+          <w:szCs w:val="24"/>
+        </w:rPr>
+        <w:t>:</w:t>
+      </w:r>
+    </w:p>
+    <w:p>
+      <w:pPr>
+        <w:rPr>
+          <w:color w:val="000000" w:themeColor="text1"/>
+        </w:rPr>
+      </w:pPr>
+      <w:r>
+        <w:rPr>
+          <w:color w:val="000000" w:themeColor="text1"/>
+        </w:rPr>
+        <w:t xml:space="preserve">A Flux publisher in Java reactive programming (from the Reactor library) is a reactive stream that can emit zero, one, or many data items asynchronously, followed by either a completion signal or an error signal. It implements the Reactive Streams Publisher interface and is commonly used when working with collections, continuous event streams, or data that arrives over time. A Flux supports non-blocking, asynchronous processing and backpressure, allowing subscribers to control how much data they receive at a time to prevent being overwhelmed. Developers can transform, filter, combine, and process emitted items using operators such as </w:t>
+      </w:r>
+      <w:proofErr w:type="gramStart"/>
+      <w:r>
+        <w:rPr>
+          <w:color w:val="000000" w:themeColor="text1"/>
+        </w:rPr>
+        <w:t>map(</w:t>
+      </w:r>
+      <w:proofErr w:type="gramEnd"/>
+      <w:r>
+        <w:rPr>
+          <w:color w:val="000000" w:themeColor="text1"/>
+        </w:rPr>
+        <w:t xml:space="preserve">), </w:t>
+      </w:r>
+      <w:proofErr w:type="gramStart"/>
+      <w:r>
+        <w:rPr>
+          <w:color w:val="000000" w:themeColor="text1"/>
+        </w:rPr>
+        <w:t>filter(</w:t>
+      </w:r>
+      <w:proofErr w:type="gramEnd"/>
+      <w:r>
+        <w:rPr>
+          <w:color w:val="000000" w:themeColor="text1"/>
+        </w:rPr>
+        <w:t xml:space="preserve">), </w:t>
+      </w:r>
+      <w:proofErr w:type="spellStart"/>
+      <w:proofErr w:type="gramStart"/>
+      <w:r>
+        <w:rPr>
+          <w:color w:val="000000" w:themeColor="text1"/>
+        </w:rPr>
+        <w:t>flatMap</w:t>
+      </w:r>
+      <w:proofErr w:type="spellEnd"/>
+      <w:r>
+        <w:rPr>
+          <w:color w:val="000000" w:themeColor="text1"/>
+        </w:rPr>
+        <w:t>(</w:t>
+      </w:r>
+      <w:proofErr w:type="gramEnd"/>
+      <w:r>
+        <w:rPr>
+          <w:color w:val="000000" w:themeColor="text1"/>
+        </w:rPr>
+        <w:t xml:space="preserve">), and </w:t>
+      </w:r>
+      <w:proofErr w:type="gramStart"/>
+      <w:r>
+        <w:rPr>
+          <w:color w:val="000000" w:themeColor="text1"/>
+        </w:rPr>
+        <w:t>reduce(</w:t>
+      </w:r>
+      <w:proofErr w:type="gramEnd"/>
+      <w:r>
+        <w:rPr>
+          <w:color w:val="000000" w:themeColor="text1"/>
+        </w:rPr>
+        <w:t xml:space="preserve">), making Flux a core building block for scalable, event-driven applications in frameworks like Spring </w:t>
+      </w:r>
+      <w:proofErr w:type="spellStart"/>
+      <w:r>
+        <w:rPr>
+          <w:color w:val="000000" w:themeColor="text1"/>
+        </w:rPr>
+        <w:t>WebFlux</w:t>
+      </w:r>
+      <w:proofErr w:type="spellEnd"/>
+      <w:r>
+        <w:rPr>
+          <w:color w:val="000000" w:themeColor="text1"/>
+        </w:rPr>
+        <w:t>.</w:t>
       </w:r>
     </w:p>
     <w:sectPr>

</xml_diff>